<commit_message>
Updated version of ai workbench
</commit_message>
<xml_diff>
--- a/backend/storage/deliverables/Approval_Note_IOCL_OPS_2026_CRACK_CD01.docx
+++ b/backend/storage/deliverables/Approval_Note_IOCL_OPS_2026_CRACK_CD01.docx
@@ -9,10 +9,10 @@
       <w:r>
         <w:rPr>
           <w:b/>
-          <w:color w:val="B40000"/>
+          <w:color w:val="B46400"/>
           <w:sz w:val="22"/>
         </w:rPr>
-        <w:t>★ CLASSIFIED: SECRET // AIR-GAPPED ON-PREMISE AI GENERATED ★</w:t>
+        <w:t>★ CLASSIFIED: CONFIDENTIAL // AIR-GAPPED ON-PREMISE AI GENERATED ★</w:t>
       </w:r>
     </w:p>
     <w:p>
@@ -104,7 +104,7 @@
           </w:tcPr>
           <w:p>
             <w:r>
-              <w:t>2026-09-04 18:43 UTC (Local Sovereign)</w:t>
+              <w:t>2026-09-12 06:33 UTC (Local Sovereign)</w:t>
             </w:r>
           </w:p>
         </w:tc>
@@ -129,7 +129,7 @@
           </w:tcPr>
           <w:p>
             <w:r>
-              <w:t>Dr. V. K. Sharma (Refinery Operations &amp; Ministry Liaison)</w:t>
+              <w:t>Priya Nair (Asset Integrity &amp; Quality Inspection)</w:t>
             </w:r>
           </w:p>
         </w:tc>
@@ -357,7 +357,7 @@
         <w:t xml:space="preserve">• Calculated Derated MAWP / Safe Metric: </w:t>
       </w:r>
       <w:r>
-        <w:t>14.84 bar (Design: 18.5 bar, Derating: -19.7%)</w:t>
+        <w:t>Sandbox calculation failed.</w:t>
         <w:br/>
       </w:r>
       <w:r>
@@ -367,7 +367,7 @@
         <w:t xml:space="preserve">• Verification Status: </w:t>
       </w:r>
       <w:r>
-        <w:t>VERIFIED (Sandbox exit code 0, 0 socket calls)</w:t>
+        <w:t>NOT VERIFIED</w:t>
       </w:r>
     </w:p>
     <w:p>
@@ -438,7 +438,7 @@
         <w:rPr>
           <w:b/>
         </w:rPr>
-        <w:t>★ CLASSIFIED: SECRET // ZERO-EGRESS GUARANTEE ★</w:t>
+        <w:t>★ CLASSIFIED: CONFIDENTIAL // ZERO-EGRESS GUARANTEE ★</w:t>
       </w:r>
     </w:p>
     <w:sectPr>

</xml_diff>